<commit_message>
v2.43: the Tell step (P13) clarified from the Evening 6 debrief (John's word, 2026-10-27) - beat 1 "Re-form pairs out of pairs" (a CCA cluster leftover) becomes "stay in the pair you worked in"; slide reads "Still in your family pair"; a short-clock line; what happened on 26 October added to the Evening 6 notes; Session 7 spare matches; leader notes rebuilt from the decks; synced to OneDrive; search index rebuilt
Co-Authored-By: Claude Opus 5.5 <noreply@anthropic.com>
</commit_message>
<xml_diff>
--- a/_implementation-notes/evening-series/FotH Evening Session 7 Leader Notes DRAFT v1.docx
+++ b/_implementation-notes/evening-series/FotH Evening Session 7 Leader Notes DRAFT v1.docx
@@ -1572,7 +1572,7 @@
         <w:t xml:space="preserve">BEATS: </w:t>
       </w:r>
       <w:r>
-        <w:t>1. Re-form pairs out of pairs. 2. Each person tells ONE specific thing they heard today — one sentence, witnessed. 3. Receive each with 'We hear that' or 'Thank you for naming that' — no preaching, no interpreting. 4. Close the pair: what we heard is given to be walked out this week.</w:t>
+        <w:t>1. Stay in the pair you worked in: the Tell happens where you heard, before anyone moves. 2. Each person tells ONE specific thing they heard today — one sentence, witnessed. 3. Receive each with 'We hear that' or 'Thank you for naming that' — no preaching, no interpreting. 4. Close the pair: what we heard is given to be walked out this week.</w:t>
       </w:r>
     </w:p>
     <w:p>
@@ -1591,6 +1591,24 @@
       </w:r>
       <w:r>
         <w:t>Arranged parent opens the round (check the Run Card) — never cold-call a teen; teens choose their own depth; pass-anytime holds.</w:t>
+      </w:r>
+    </w:p>
+    <w:p>
+      <w:pPr>
+        <w:pBdr>
+          <w:left w:val="double" w:sz="12" w:space="8" w:color="B45309"/>
+        </w:pBdr>
+        <w:spacing w:before="0" w:after="60"/>
+      </w:pPr>
+      <w:r>
+        <w:rPr>
+          <w:b/>
+          <w:color w:val="595959"/>
+        </w:rPr>
+        <w:t xml:space="preserve">IF TIME RAN SHORT: </w:t>
+      </w:r>
+      <w:r>
+        <w:t>If only one of you walked the six steps, that one still tells. The Listener tells one thing they noticed while listening.</w:t>
       </w:r>
     </w:p>
     <w:p>

</xml_diff>

<commit_message>
v2.44: the merge (P14) invites each person to say briefly what they heard (John's word, 2026-10-27, from the Evening 6 debrief); the Tell gives three minutes to the merge (Tell 8:13-8:16, merge 8:16-8:20); decks, leader notes, both run sheets, Pair Card and the Evening 6 page updated; Session 7 spare matches; P13 lines tightened to keep the notes on four pages; synced to OneDrive; search index rebuilt
Co-Authored-By: Claude Opus 5.5 <noreply@anthropic.com>
</commit_message>
<xml_diff>
--- a/_implementation-notes/evening-series/FotH Evening Session 7 Leader Notes DRAFT v1.docx
+++ b/_implementation-notes/evening-series/FotH Evening Session 7 Leader Notes DRAFT v1.docx
@@ -1538,7 +1538,7 @@
           <w:color w:val="6B8E3F"/>
           <w:sz w:val="18"/>
         </w:rPr>
-        <w:t xml:space="preserve">S7 · 8:13–8:19 · </w:t>
+        <w:t xml:space="preserve">S7 · 8:13–8:16 · </w:t>
       </w:r>
       <w:r>
         <w:rPr>
@@ -1608,7 +1608,7 @@
         <w:t xml:space="preserve">IF TIME RAN SHORT: </w:t>
       </w:r>
       <w:r>
-        <w:t>If only one of you walked the six steps, that one still tells. The Listener tells one thing they noticed while listening.</w:t>
+        <w:t>If only one of you walked the steps, that one tells; the Listener tells what they noticed.</w:t>
       </w:r>
     </w:p>
     <w:p>
@@ -1669,7 +1669,7 @@
           <w:color w:val="6B8E3F"/>
           <w:sz w:val="18"/>
         </w:rPr>
-        <w:t xml:space="preserve">S7 · 8:19–8:20 · </w:t>
+        <w:t xml:space="preserve">S7 · 8:16–8:20 · </w:t>
       </w:r>
       <w:r>
         <w:rPr>
@@ -1702,7 +1702,7 @@
         <w:t xml:space="preserve">BEATS: </w:t>
       </w:r>
       <w:r>
-        <w:t>1. One word each — not what you heard (that is yours), but what the practice was like. 2. Introduce daily PROAPT: one short passage, five to ten minutes, every day — the journal Week 7 pages have the template. 3. Hold up H7.3: passage paths for teens and parents. 4. 'The chain only works if we work it.'</w:t>
+        <w:t>1. Each person says briefly what they heard tonight — the one sentence told in the pair. Receive it with 'We hear that'; no comment. On 26 October this was when the room came alive. 2. Introduce daily PROAPT: one short passage, five to ten minutes, every day — the journal Week 7 pages have the template. 3. Hold up H7.3: passage paths for teens and parents. 4. 'The chain only works if we work it.'</w:t>
       </w:r>
     </w:p>
     <w:p>
@@ -1720,7 +1720,7 @@
         <w:t xml:space="preserve">CUES: </w:t>
       </w:r>
       <w:r>
-        <w:t>Arranged parent begins the word round; anyone may pass.</w:t>
+        <w:t>Arranged parent begins; anyone may pass; one sentence each.</w:t>
       </w:r>
     </w:p>
     <w:p>

</xml_diff>